<commit_message>
Add web template/logo management and set the default brand mark.
Let operators update the gold master and logo from System without repo access, and ship the Spotlight Advocate logo in the header.

Co-authored-by: Cursor <cursoragent@cursor.com>
</commit_message>
<xml_diff>
--- a/Template/SpotlightAdvocate.docx
+++ b/Template/SpotlightAdvocate.docx
@@ -13,7 +13,6 @@
           <w:color w:val="1A2B4A"/>
           <w:sz w:val="24"/>
         </w:rPr>
-        <w:t>SPOTLIGHT ADVOCATE</w:t>
       </w:r>
     </w:p>
     <w:p>
@@ -30,7 +29,6 @@
           <w:color w:val="555555"/>
           <w:sz w:val="18"/>
         </w:rPr>
-        <w:t>Official Document</w:t>
       </w:r>
     </w:p>
     <w:p>
@@ -177,6 +175,7 @@
     </w:p>
     <w:sectPr>
       <w:footerReference w:type="default" r:id="rId9"/>
+      <w:headerReference w:type="default" r:id="rId10"/>
       <w:pgSz w:w="12240" w:h="15840"/>
       <w:pgMar w:top="1224" w:right="1440" w:bottom="1224" w:left="1440" w:header="720" w:footer="720" w:gutter="0"/>
       <w:cols w:space="720"/>
@@ -214,6 +213,50 @@
     </w:r>
   </w:p>
 </w:ftr>
+</file>
+
+<file path=word/header1.xml><?xml version="1.0" encoding="utf-8"?>
+<w:hdr xmlns:m="http://schemas.openxmlformats.org/officeDocument/2006/math" xmlns:mc="http://schemas.openxmlformats.org/markup-compatibility/2006" xmlns:mo="http://schemas.microsoft.com/office/mac/office/2008/main" xmlns:mv="urn:schemas-microsoft-com:mac:vml" xmlns:o="urn:schemas-microsoft-com:office:office" xmlns:r="http://schemas.openxmlformats.org/officeDocument/2006/relationships" xmlns:v="urn:schemas-microsoft-com:vml" xmlns:w10="urn:schemas-microsoft-com:office:word" xmlns:w14="http://schemas.microsoft.com/office/word/2010/wordml" xmlns:w="http://schemas.openxmlformats.org/wordprocessingml/2006/main" xmlns:wne="http://schemas.microsoft.com/office/word/2006/wordml" xmlns:wp14="http://schemas.microsoft.com/office/word/2010/wordprocessingDrawing" xmlns:wp="http://schemas.openxmlformats.org/drawingml/2006/wordprocessingDrawing" xmlns:wpc="http://schemas.microsoft.com/office/word/2010/wordprocessingCanvas" xmlns:wpg="http://schemas.microsoft.com/office/word/2010/wordprocessingGroup" xmlns:wpi="http://schemas.microsoft.com/office/word/2010/wordprocessingInk" xmlns:wps="http://schemas.microsoft.com/office/word/2010/wordprocessingShape" mc:Ignorable="w14 wp14">
+  <w:p>
+    <w:pPr>
+      <w:jc w:val="left"/>
+    </w:pPr>
+    <w:r>
+      <w:drawing>
+        <wp:inline xmlns:a="http://schemas.openxmlformats.org/drawingml/2006/main" xmlns:pic="http://schemas.openxmlformats.org/drawingml/2006/picture">
+          <wp:extent cx="2194560" cy="639532"/>
+          <wp:docPr id="1" name="Picture 1"/>
+          <wp:cNvGraphicFramePr>
+            <a:graphicFrameLocks noChangeAspect="1"/>
+          </wp:cNvGraphicFramePr>
+          <a:graphic>
+            <a:graphicData uri="http://schemas.openxmlformats.org/drawingml/2006/picture">
+              <pic:pic>
+                <pic:nvPicPr>
+                  <pic:cNvPr id="0" name="logo.png"/>
+                  <pic:cNvPicPr/>
+                </pic:nvPicPr>
+                <pic:blipFill>
+                  <a:blip r:embed="rId1"/>
+                  <a:stretch>
+                    <a:fillRect/>
+                  </a:stretch>
+                </pic:blipFill>
+                <pic:spPr>
+                  <a:xfrm>
+                    <a:off x="0" y="0"/>
+                    <a:ext cx="2194560" cy="639532"/>
+                  </a:xfrm>
+                  <a:prstGeom prst="rect"/>
+                </pic:spPr>
+              </pic:pic>
+            </a:graphicData>
+          </a:graphic>
+        </wp:inline>
+      </w:drawing>
+    </w:r>
+  </w:p>
+</w:hdr>
 </file>
 
 <file path=word/numbering.xml><?xml version="1.0" encoding="utf-8"?>

</xml_diff>